<commit_message>
[W1] adopt Ink + Emerald + Slate design system and add sprint plan
Replace the teal/mint palette across CLAUDE.md, PRD Section 4 and the UI
Design Brief, with WCAG AA usage rules (Emerald Deep for small text,
Muted for input borders). Add the 6-week sprint plan to /docs.

Co-Authored-By: Claude Opus 5 <noreply@anthropic.com>
</commit_message>
<xml_diff>
--- a/docs/StartupConnectAI_PRD.docx
+++ b/docs/StartupConnectAI_PRD.docx
@@ -4434,7 +4434,7 @@
                 <w:sz w:val="20"/>
                 <w:szCs w:val="20"/>
               </w:rPr>
-              <w:t xml:space="preserve">#0B2027 — buttons on light bg, primary text, dark surfaces</w:t>
+              <w:t xml:space="preserve">#0B0F19 — buttons on light bg, primary text, dark surfaces</w:t>
             </w:r>
           </w:p>
         </w:tc>
@@ -4464,7 +4464,7 @@
                 <w:sz w:val="20"/>
                 <w:szCs w:val="20"/>
               </w:rPr>
-              <w:t xml:space="preserve">Accent — Teal</w:t>
+              <w:t xml:space="preserve">Accent — Emerald</w:t>
             </w:r>
           </w:p>
         </w:tc>
@@ -4492,7 +4492,7 @@
                 <w:sz w:val="20"/>
                 <w:szCs w:val="20"/>
               </w:rPr>
-              <w:t xml:space="preserve">#028090 — links, section headers, primary brand accents</w:t>
+              <w:t xml:space="preserve">#059669 — brand accents, icons, large headers (links and small text use Emerald Deep)</w:t>
             </w:r>
           </w:p>
         </w:tc>
@@ -4522,7 +4522,7 @@
                 <w:sz w:val="20"/>
                 <w:szCs w:val="20"/>
               </w:rPr>
-              <w:t xml:space="preserve">Accent — Seafoam</w:t>
+              <w:t xml:space="preserve">Accent — Emerald Deep</w:t>
             </w:r>
           </w:p>
         </w:tc>
@@ -4550,7 +4550,7 @@
                 <w:sz w:val="20"/>
                 <w:szCs w:val="20"/>
               </w:rPr>
-              <w:t xml:space="preserve">#00A896 — secondary accents, tags, chips</w:t>
+              <w:t xml:space="preserve">#047857 — links, tag/chip text, small emerald text on light backgrounds</w:t>
             </w:r>
           </w:p>
         </w:tc>
@@ -4580,7 +4580,7 @@
                 <w:sz w:val="20"/>
                 <w:szCs w:val="20"/>
               </w:rPr>
-              <w:t xml:space="preserve">Accent — Mint</w:t>
+              <w:t xml:space="preserve">Accent — Emerald Bright</w:t>
             </w:r>
           </w:p>
         </w:tc>
@@ -4608,7 +4608,7 @@
                 <w:sz w:val="20"/>
                 <w:szCs w:val="20"/>
               </w:rPr>
-              <w:t xml:space="preserve">#02C39A — success, positive state, verified badges</w:t>
+              <w:t xml:space="preserve">#10B981 — fit-score indicators, success, verified badge fills (never text on light backgrounds)</w:t>
             </w:r>
           </w:p>
         </w:tc>
@@ -4666,7 +4666,7 @@
                 <w:sz w:val="20"/>
                 <w:szCs w:val="20"/>
               </w:rPr>
-              <w:t xml:space="preserve">#5C7A78 — secondary text, metadata</w:t>
+              <w:t xml:space="preserve">#64748B — metadata, subheaders, input borders</w:t>
             </w:r>
           </w:p>
         </w:tc>
@@ -4696,7 +4696,7 @@
                 <w:sz w:val="20"/>
                 <w:szCs w:val="20"/>
               </w:rPr>
-              <w:t xml:space="preserve">Surface — Off-white</w:t>
+              <w:t xml:space="preserve">Surface — Slate 50</w:t>
             </w:r>
           </w:p>
         </w:tc>
@@ -4724,7 +4724,7 @@
                 <w:sz w:val="20"/>
                 <w:szCs w:val="20"/>
               </w:rPr>
-              <w:t xml:space="preserve">#F4FAF9 — card backgrounds, subtle sections</w:t>
+              <w:t xml:space="preserve">#F8FAFC — card backgrounds, subtle sections</w:t>
             </w:r>
           </w:p>
         </w:tc>
@@ -4754,7 +4754,7 @@
                 <w:sz w:val="20"/>
                 <w:szCs w:val="20"/>
               </w:rPr>
-              <w:t xml:space="preserve">Surface — Band</w:t>
+              <w:t xml:space="preserve">Surface — Slate 100 / Border</w:t>
             </w:r>
           </w:p>
         </w:tc>
@@ -4782,7 +4782,7 @@
                 <w:sz w:val="20"/>
                 <w:szCs w:val="20"/>
               </w:rPr>
-              <w:t xml:space="preserve">#E3EFEE — dividers, table row bands</w:t>
+              <w:t xml:space="preserve">#F1F5F9 row bands and hover fills · #E2E8F0 borders and dividers</w:t>
             </w:r>
           </w:p>
         </w:tc>
@@ -4956,7 +4956,7 @@
                 <w:sz w:val="20"/>
                 <w:szCs w:val="20"/>
               </w:rPr>
-              <w:t xml:space="preserve">Georgia (serif) — H1 34–44pt, H2 26pt, H3 22pt</w:t>
+              <w:t xml:space="preserve">Georgia (serif) — H1 32px, H2 24px, H3 20px, H4 16px (landing hero 48–56px)</w:t>
             </w:r>
           </w:p>
         </w:tc>
@@ -5014,7 +5014,7 @@
                 <w:sz w:val="20"/>
                 <w:szCs w:val="20"/>
               </w:rPr>
-              <w:t xml:space="preserve">Calibri (sans-serif) — body 16px web / 22 half-pt docx equivalent</w:t>
+              <w:t xml:space="preserve">Inter (sans-serif) — 16px base, 14px small, 12px meta</w:t>
             </w:r>
           </w:p>
         </w:tc>
@@ -5072,7 +5072,7 @@
                 <w:sz w:val="20"/>
                 <w:szCs w:val="20"/>
               </w:rPr>
-              <w:t xml:space="preserve">Consolas / JetBrains Mono — for API endpoints, code, IDs</w:t>
+              <w:t xml:space="preserve">JetBrains Mono — for API endpoints, code, IDs</w:t>
             </w:r>
           </w:p>
         </w:tc>
@@ -5246,7 +5246,7 @@
                 <w:sz w:val="20"/>
                 <w:szCs w:val="20"/>
               </w:rPr>
-              <w:t xml:space="preserve">Two levels only: flat (default) and card (subtle shadow: 0 1px 3px rgba(0,0,0,0.08))</w:t>
+              <w:t xml:space="preserve">Two levels only: flat (default) and card (subtle shadow: 0 1px 3px rgba(0,0,0,0.06))</w:t>
             </w:r>
           </w:p>
         </w:tc>
@@ -5287,7 +5287,7 @@
           <w:sz w:val="22"/>
           <w:szCs w:val="22"/>
         </w:rPr>
-        <w:t xml:space="preserve">Buttons: primary (Ink bg, white text), secondary (white bg, Ink border), ghost (transparent, Teal text). No more than one primary button per view.</w:t>
+        <w:t xml:space="preserve">Buttons: primary (Ink bg, white text), secondary (white bg, Ink border), ghost (transparent, Emerald Deep text). No more than one primary button per view.</w:t>
       </w:r>
     </w:p>
     <w:p>
@@ -5308,7 +5308,7 @@
           <w:sz w:val="22"/>
           <w:szCs w:val="22"/>
         </w:rPr>
-        <w:t xml:space="preserve">Cards: 8px radius, 16-24px inner padding, no border, subtle shadow. Match cards use a 4px left border in Mint for high-fit matches (≥ 0.8).</w:t>
+        <w:t xml:space="preserve">Cards: 8px radius, 16-24px inner padding, 1px Border #E2E8F0, subtle shadow. Match cards use a 4px left border in Emerald Bright for high-fit matches (≥ 0.8).</w:t>
       </w:r>
     </w:p>
     <w:p>
@@ -5329,7 +5329,7 @@
           <w:sz w:val="22"/>
           <w:szCs w:val="22"/>
         </w:rPr>
-        <w:t xml:space="preserve">Inputs: 6px radius, 12px inner padding, Ink text on white bg, Teal focus ring. Placeholder text in Muted.</w:t>
+        <w:t xml:space="preserve">Inputs: 6px radius, 12px inner padding, Ink text on white bg, Emerald focus ring. Placeholder text in Muted.</w:t>
       </w:r>
     </w:p>
     <w:p>

</xml_diff>